<commit_message>
Add TypeScript config and production build scripts
</commit_message>
<xml_diff>
--- a/Documento_Tecnico_Bisuteria.docx
+++ b/Documento_Tecnico_Bisuteria.docx
@@ -1695,6 +1695,9 @@
     <w:p>
       <w:r>
         <w:t>Vite. (2024). Vite: Next generation frontend tooling. https://vitejs.dev/</w:t>
+        <w:br/>
+        <w:br/>
+        <w:t>GitHub. (2026). Repositorio del proyecto bisuteria-back-y-front. https://github.com/leliasierra/bisuteria-back-y-front</w:t>
       </w:r>
     </w:p>
     <w:p>
@@ -1707,6 +1710,184 @@
         <w:t>American Psychological Association. (2026). Publication manual of the American Psychological Association (7th ed.). American Psychological Association.</w:t>
       </w:r>
     </w:p>
+    <w:p>
+      <w:pPr>
+        <w:pStyle w:val="Heading2"/>
+      </w:pPr>
+      <w:r>
+        <w:t>7.1 Scripts Disponibles</w:t>
+      </w:r>
+    </w:p>
+    <w:tbl>
+      <w:tblPr>
+        <w:tblW w:type="auto" w:w="0"/>
+        <w:tblLook w:firstColumn="1" w:firstRow="1" w:lastColumn="0" w:lastRow="0" w:noHBand="0" w:noVBand="1" w:val="04A0"/>
+      </w:tblPr>
+      <w:tblGrid>
+        <w:gridCol w:w="4320"/>
+        <w:gridCol w:w="4320"/>
+      </w:tblGrid>
+      <w:tr>
+        <w:tc>
+          <w:tcPr>
+            <w:tcW w:type="dxa" w:w="4320"/>
+          </w:tcPr>
+          <w:p>
+            <w:r>
+              <w:rPr>
+                <w:b/>
+              </w:rPr>
+              <w:t>Comando</w:t>
+            </w:r>
+          </w:p>
+        </w:tc>
+        <w:tc>
+          <w:tcPr>
+            <w:tcW w:type="dxa" w:w="4320"/>
+          </w:tcPr>
+          <w:p>
+            <w:r>
+              <w:rPr>
+                <w:b/>
+              </w:rPr>
+              <w:t>Descripción</w:t>
+            </w:r>
+          </w:p>
+        </w:tc>
+      </w:tr>
+      <w:tr>
+        <w:tc>
+          <w:tcPr>
+            <w:tcW w:type="dxa" w:w="4320"/>
+          </w:tcPr>
+          <w:p>
+            <w:r>
+              <w:t>npm run install:all</w:t>
+            </w:r>
+          </w:p>
+        </w:tc>
+        <w:tc>
+          <w:tcPr>
+            <w:tcW w:type="dxa" w:w="4320"/>
+          </w:tcPr>
+          <w:p>
+            <w:r>
+              <w:t>Instala todas las dependencias del proyecto</w:t>
+            </w:r>
+          </w:p>
+        </w:tc>
+      </w:tr>
+      <w:tr>
+        <w:tc>
+          <w:tcPr>
+            <w:tcW w:type="dxa" w:w="4320"/>
+          </w:tcPr>
+          <w:p>
+            <w:r>
+              <w:t>npm run dev</w:t>
+            </w:r>
+          </w:p>
+        </w:tc>
+        <w:tc>
+          <w:tcPr>
+            <w:tcW w:type="dxa" w:w="4320"/>
+          </w:tcPr>
+          <w:p>
+            <w:r>
+              <w:t>Inicia backend y frontend simultáneamente</w:t>
+            </w:r>
+          </w:p>
+        </w:tc>
+      </w:tr>
+      <w:tr>
+        <w:tc>
+          <w:tcPr>
+            <w:tcW w:type="dxa" w:w="4320"/>
+          </w:tcPr>
+          <w:p>
+            <w:r>
+              <w:t>npm run dev:backend</w:t>
+            </w:r>
+          </w:p>
+        </w:tc>
+        <w:tc>
+          <w:tcPr>
+            <w:tcW w:type="dxa" w:w="4320"/>
+          </w:tcPr>
+          <w:p>
+            <w:r>
+              <w:t>Inicia solo el backend (puerto 3000)</w:t>
+            </w:r>
+          </w:p>
+        </w:tc>
+      </w:tr>
+      <w:tr>
+        <w:tc>
+          <w:tcPr>
+            <w:tcW w:type="dxa" w:w="4320"/>
+          </w:tcPr>
+          <w:p>
+            <w:r>
+              <w:t>npm run dev:frontend</w:t>
+            </w:r>
+          </w:p>
+        </w:tc>
+        <w:tc>
+          <w:tcPr>
+            <w:tcW w:type="dxa" w:w="4320"/>
+          </w:tcPr>
+          <w:p>
+            <w:r>
+              <w:t>Inicia solo el frontend (puerto 5173)</w:t>
+            </w:r>
+          </w:p>
+        </w:tc>
+      </w:tr>
+      <w:tr>
+        <w:tc>
+          <w:tcPr>
+            <w:tcW w:type="dxa" w:w="4320"/>
+          </w:tcPr>
+          <w:p>
+            <w:r>
+              <w:t>npm run build</w:t>
+            </w:r>
+          </w:p>
+        </w:tc>
+        <w:tc>
+          <w:tcPr>
+            <w:tcW w:type="dxa" w:w="4320"/>
+          </w:tcPr>
+          <w:p>
+            <w:r>
+              <w:t>Compila el frontend para producción</w:t>
+            </w:r>
+          </w:p>
+        </w:tc>
+      </w:tr>
+      <w:tr>
+        <w:tc>
+          <w:tcPr>
+            <w:tcW w:type="dxa" w:w="4320"/>
+          </w:tcPr>
+          <w:p>
+            <w:r>
+              <w:t>npm start</w:t>
+            </w:r>
+          </w:p>
+        </w:tc>
+        <w:tc>
+          <w:tcPr>
+            <w:tcW w:type="dxa" w:w="4320"/>
+          </w:tcPr>
+          <w:p>
+            <w:r>
+              <w:t>Inicia el backend en modo producción</w:t>
+            </w:r>
+          </w:p>
+        </w:tc>
+      </w:tr>
+    </w:tbl>
     <w:sectPr>
       <w:pgSz w:w="12240" w:h="15840"/>
       <w:pgMar w:top="1440" w:right="1800" w:bottom="1440" w:left="1800" w:header="720" w:footer="720" w:gutter="0"/>

</xml_diff>

<commit_message>
Add createdAt field, search/filter/sort for products and sales
</commit_message>
<xml_diff>
--- a/Documento_Tecnico_Bisuteria.docx
+++ b/Documento_Tecnico_Bisuteria.docx
@@ -1714,9 +1714,7 @@
       <w:pPr>
         <w:pStyle w:val="Heading2"/>
       </w:pPr>
-      <w:r>
-        <w:t>7.1 Scripts Disponibles</w:t>
-      </w:r>
+      <w:r/>
     </w:p>
     <w:tbl>
       <w:tblPr>
@@ -1883,6 +1881,198 @@
           <w:p>
             <w:r>
               <w:t>Inicia el backend en modo producción</w:t>
+            </w:r>
+          </w:p>
+        </w:tc>
+      </w:tr>
+    </w:tbl>
+    <w:tbl>
+      <w:tblPr>
+        <w:tblW w:type="auto" w:w="0"/>
+        <w:tblLook w:firstColumn="1" w:firstRow="1" w:lastColumn="0" w:lastRow="0" w:noHBand="0" w:noVBand="1" w:val="04A0"/>
+      </w:tblPr>
+      <w:tblGrid>
+        <w:gridCol w:w="4320"/>
+        <w:gridCol w:w="4320"/>
+      </w:tblGrid>
+      <w:tr>
+        <w:tc>
+          <w:tcPr>
+            <w:tcW w:type="dxa" w:w="4320"/>
+          </w:tcPr>
+          <w:p>
+            <w:r>
+              <w:rPr>
+                <w:b/>
+              </w:rPr>
+              <w:t>Comando</w:t>
+            </w:r>
+          </w:p>
+        </w:tc>
+        <w:tc>
+          <w:tcPr>
+            <w:tcW w:type="dxa" w:w="4320"/>
+          </w:tcPr>
+          <w:p>
+            <w:r>
+              <w:rPr>
+                <w:b/>
+              </w:rPr>
+              <w:t>Descripción</w:t>
+            </w:r>
+          </w:p>
+        </w:tc>
+      </w:tr>
+      <w:tr>
+        <w:tc>
+          <w:tcPr>
+            <w:tcW w:type="dxa" w:w="4320"/>
+          </w:tcPr>
+          <w:p>
+            <w:r>
+              <w:t>npm run install:all</w:t>
+            </w:r>
+          </w:p>
+        </w:tc>
+        <w:tc>
+          <w:tcPr>
+            <w:tcW w:type="dxa" w:w="4320"/>
+          </w:tcPr>
+          <w:p>
+            <w:r>
+              <w:t>Instala todas las dependencias del proyecto</w:t>
+            </w:r>
+          </w:p>
+        </w:tc>
+      </w:tr>
+      <w:tr>
+        <w:tc>
+          <w:tcPr>
+            <w:tcW w:type="dxa" w:w="4320"/>
+          </w:tcPr>
+          <w:p>
+            <w:r>
+              <w:t>npm run dev</w:t>
+            </w:r>
+          </w:p>
+        </w:tc>
+        <w:tc>
+          <w:tcPr>
+            <w:tcW w:type="dxa" w:w="4320"/>
+          </w:tcPr>
+          <w:p>
+            <w:r>
+              <w:t>Inicia backend y frontend simultáneamente</w:t>
+            </w:r>
+          </w:p>
+        </w:tc>
+      </w:tr>
+      <w:tr>
+        <w:tc>
+          <w:tcPr>
+            <w:tcW w:type="dxa" w:w="4320"/>
+          </w:tcPr>
+          <w:p>
+            <w:r>
+              <w:t>npm run dev:backend</w:t>
+            </w:r>
+          </w:p>
+        </w:tc>
+        <w:tc>
+          <w:tcPr>
+            <w:tcW w:type="dxa" w:w="4320"/>
+          </w:tcPr>
+          <w:p>
+            <w:r>
+              <w:t>Inicia solo el backend (puerto 3000)</w:t>
+            </w:r>
+          </w:p>
+        </w:tc>
+      </w:tr>
+      <w:tr>
+        <w:tc>
+          <w:tcPr>
+            <w:tcW w:type="dxa" w:w="4320"/>
+          </w:tcPr>
+          <w:p>
+            <w:r>
+              <w:t>npm run dev:frontend</w:t>
+            </w:r>
+          </w:p>
+        </w:tc>
+        <w:tc>
+          <w:tcPr>
+            <w:tcW w:type="dxa" w:w="4320"/>
+          </w:tcPr>
+          <w:p>
+            <w:r>
+              <w:t>Inicia solo el frontend (puerto 5173)</w:t>
+            </w:r>
+          </w:p>
+        </w:tc>
+      </w:tr>
+      <w:tr>
+        <w:tc>
+          <w:tcPr>
+            <w:tcW w:type="dxa" w:w="4320"/>
+          </w:tcPr>
+          <w:p>
+            <w:r>
+              <w:t>npm run build</w:t>
+            </w:r>
+          </w:p>
+        </w:tc>
+        <w:tc>
+          <w:tcPr>
+            <w:tcW w:type="dxa" w:w="4320"/>
+          </w:tcPr>
+          <w:p>
+            <w:r>
+              <w:t>Compila backend y frontend para producción</w:t>
+            </w:r>
+          </w:p>
+        </w:tc>
+      </w:tr>
+      <w:tr>
+        <w:tc>
+          <w:tcPr>
+            <w:tcW w:type="dxa" w:w="4320"/>
+          </w:tcPr>
+          <w:p>
+            <w:r>
+              <w:t>npm run start:prod</w:t>
+            </w:r>
+          </w:p>
+        </w:tc>
+        <w:tc>
+          <w:tcPr>
+            <w:tcW w:type="dxa" w:w="4320"/>
+          </w:tcPr>
+          <w:p>
+            <w:r>
+              <w:t>Compila y levanta ambos en producción (puertos 3000 y 4173)</w:t>
+            </w:r>
+          </w:p>
+        </w:tc>
+      </w:tr>
+      <w:tr>
+        <w:tc>
+          <w:tcPr>
+            <w:tcW w:type="dxa" w:w="4320"/>
+          </w:tcPr>
+          <w:p>
+            <w:r>
+              <w:t>npm run prod</w:t>
+            </w:r>
+          </w:p>
+        </w:tc>
+        <w:tc>
+          <w:tcPr>
+            <w:tcW w:type="dxa" w:w="4320"/>
+          </w:tcPr>
+          <w:p>
+            <w:r>
+              <w:t>Igual a start:prod</w:t>
             </w:r>
           </w:p>
         </w:tc>

</xml_diff>